<commit_message>
Add Voice Experiment project to Projects section
- Add 第三次语音实验 (Third Voice Experiment) project page
- Includes Griffin-Lim algorithm and RVC voice conversion experiment reports
- Update projects listing to include the new project

Co-Authored-By: Claude Opus 4.8 <noreply@anthropic.com>
</commit_message>
<xml_diff>
--- a/docs/posts/Projects/LLM_Pre-Training/报告.docx
+++ b/docs/posts/Projects/LLM_Pre-Training/报告.docx
@@ -48767,6 +48767,899 @@
     </w:p>
     <w:bookmarkEnd w:id="123"/>
     <w:bookmarkEnd w:id="124"/>
+    <w:bookmarkStart w:id="129" w:name="建议"/>
+    <w:p>
+      <w:pPr>
+        <w:pStyle w:val="Heading2"/>
+      </w:pPr>
+      <w:r>
+        <w:t xml:space="preserve">10 </w:t>
+      </w:r>
+      <w:r>
+        <w:rPr>
+          <w:rFonts w:hint="eastAsia"/>
+        </w:rPr>
+        <w:t xml:space="preserve">建议</w:t>
+      </w:r>
+    </w:p>
+    <w:bookmarkStart w:id="126" w:name="优先阅读代码而非训练实操"/>
+    <w:p>
+      <w:pPr>
+        <w:pStyle w:val="Heading3"/>
+      </w:pPr>
+      <w:r>
+        <w:rPr>
+          <w:rFonts w:hint="eastAsia"/>
+        </w:rPr>
+        <w:t xml:space="preserve">优先阅读代码而非训练实操</w:t>
+      </w:r>
+    </w:p>
+    <w:p>
+      <w:pPr>
+        <w:pStyle w:val="FirstParagraph"/>
+      </w:pPr>
+      <w:r>
+        <w:rPr>
+          <w:rFonts w:hint="eastAsia"/>
+        </w:rPr>
+        <w:t xml:space="preserve">如果你想要学习大模型的预训练，我们推荐你去看模型和训练部分的代码，而不是投入大量时间进行训练实操。</w:t>
+      </w:r>
+    </w:p>
+    <w:p>
+      <w:pPr>
+        <w:pStyle w:val="BodyText"/>
+      </w:pPr>
+      <w:r>
+        <w:rPr>
+          <w:rFonts w:hint="eastAsia"/>
+        </w:rPr>
+        <w:t xml:space="preserve">原因有三：其一，80M</w:t>
+      </w:r>
+      <w:r>
+        <w:t xml:space="preserve"> </w:t>
+      </w:r>
+      <w:r>
+        <w:rPr>
+          <w:rFonts w:hint="eastAsia"/>
+        </w:rPr>
+        <w:t xml:space="preserve">的模型参数量太小，模型最终效果有限，生成质量与真正的大模型相去甚远；其二，80M</w:t>
+      </w:r>
+      <w:r>
+        <w:t xml:space="preserve"> </w:t>
+      </w:r>
+      <w:r>
+        <w:rPr>
+          <w:rFonts w:hint="eastAsia"/>
+        </w:rPr>
+        <w:t xml:space="preserve">规模的预训练耗时并不短（本项目在单张</w:t>
+      </w:r>
+      <w:r>
+        <w:t xml:space="preserve"> 4090 </w:t>
+      </w:r>
+      <w:r>
+        <w:rPr>
+          <w:rFonts w:hint="eastAsia"/>
+        </w:rPr>
+        <w:t xml:space="preserve">上仍需约</w:t>
+      </w:r>
+      <w:r>
+        <w:t xml:space="preserve"> 6 </w:t>
+      </w:r>
+      <w:r>
+        <w:rPr>
+          <w:rFonts w:hint="eastAsia"/>
+        </w:rPr>
+        <w:t xml:space="preserve">小时），但换来的体验却非常有限；其三，也是最重要的一点——80M</w:t>
+      </w:r>
+      <w:r>
+        <w:t xml:space="preserve"> </w:t>
+      </w:r>
+      <w:r>
+        <w:rPr>
+          <w:rFonts w:hint="eastAsia"/>
+        </w:rPr>
+        <w:t xml:space="preserve">大小的预训练</w:t>
+      </w:r>
+      <w:r>
+        <w:rPr>
+          <w:rFonts w:hint="eastAsia"/>
+          <w:b/>
+          <w:bCs/>
+        </w:rPr>
+        <w:t xml:space="preserve">无法让你体验到现代大模型训练过程中的各种优化技术和实际挑战</w:t>
+      </w:r>
+      <w:r>
+        <w:t xml:space="preserve">。</w:t>
+      </w:r>
+    </w:p>
+    <w:bookmarkStart w:id="125" w:name="代码测试非常重要"/>
+    <w:p>
+      <w:pPr>
+        <w:pStyle w:val="Heading4"/>
+      </w:pPr>
+      <w:r>
+        <w:rPr>
+          <w:rFonts w:hint="eastAsia"/>
+        </w:rPr>
+        <w:t xml:space="preserve">代码测试非常重要</w:t>
+      </w:r>
+    </w:p>
+    <w:p>
+      <w:pPr>
+        <w:pStyle w:val="FirstParagraph"/>
+      </w:pPr>
+      <w:r>
+        <w:rPr>
+          <w:rFonts w:hint="eastAsia"/>
+        </w:rPr>
+        <w:t xml:space="preserve">本项目中我们踩过两个印象深刻的</w:t>
+      </w:r>
+      <w:r>
+        <w:t xml:space="preserve"> </w:t>
+      </w:r>
+      <w:r>
+        <w:rPr>
+          <w:rFonts w:hint="eastAsia"/>
+        </w:rPr>
+        <w:t xml:space="preserve">bug，都是因为缺少充分的单元测试导致的，浪费了大量训练时间：</w:t>
+      </w:r>
+    </w:p>
+    <w:p>
+      <w:pPr>
+        <w:pStyle w:val="BodyText"/>
+      </w:pPr>
+      <w:r>
+        <w:rPr>
+          <w:b/>
+          <w:bCs/>
+        </w:rPr>
+        <w:t xml:space="preserve">Bug </w:t>
+      </w:r>
+      <w:r>
+        <w:rPr>
+          <w:rFonts w:hint="eastAsia"/>
+          <w:b/>
+          <w:bCs/>
+        </w:rPr>
+        <w:t xml:space="preserve">1：TransformerBlock</w:t>
+      </w:r>
+      <w:r>
+        <w:rPr>
+          <w:b/>
+          <w:bCs/>
+        </w:rPr>
+        <w:t xml:space="preserve"> </w:t>
+      </w:r>
+      <w:r>
+        <w:rPr>
+          <w:rFonts w:hint="eastAsia"/>
+          <w:b/>
+          <w:bCs/>
+        </w:rPr>
+        <w:t xml:space="preserve">忘记继承</w:t>
+      </w:r>
+      <w:r>
+        <w:rPr>
+          <w:b/>
+          <w:bCs/>
+        </w:rPr>
+        <w:t xml:space="preserve"> </w:t>
+      </w:r>
+      <w:r>
+        <w:rPr>
+          <w:rStyle w:val="VerbatimChar"/>
+          <w:b/>
+          <w:bCs/>
+        </w:rPr>
+        <w:t xml:space="preserve">nn.Module</w:t>
+      </w:r>
+      <w:r>
+        <w:rPr>
+          <w:b/>
+          <w:bCs/>
+        </w:rPr>
+        <w:t xml:space="preserve">。</w:t>
+      </w:r>
+      <w:r>
+        <w:t xml:space="preserve"> </w:t>
+      </w:r>
+      <w:r>
+        <w:rPr>
+          <w:rFonts w:hint="eastAsia"/>
+        </w:rPr>
+        <w:t xml:space="preserve">在模型搭建部分，</w:t>
+      </w:r>
+      <w:r>
+        <w:rPr>
+          <w:rStyle w:val="VerbatimChar"/>
+        </w:rPr>
+        <w:t xml:space="preserve">transformer_block</w:t>
+      </w:r>
+      <w:r>
+        <w:t xml:space="preserve"> </w:t>
+      </w:r>
+      <w:r>
+        <w:rPr>
+          <w:rFonts w:hint="eastAsia"/>
+        </w:rPr>
+        <w:t xml:space="preserve">类忘记写</w:t>
+      </w:r>
+      <w:r>
+        <w:t xml:space="preserve"> </w:t>
+      </w:r>
+      <w:r>
+        <w:rPr>
+          <w:rStyle w:val="VerbatimChar"/>
+        </w:rPr>
+        <w:t xml:space="preserve">(nn.Module)</w:t>
+      </w:r>
+      <w:r>
+        <w:t xml:space="preserve"> </w:t>
+      </w:r>
+      <w:r>
+        <w:rPr>
+          <w:rFonts w:hint="eastAsia"/>
+        </w:rPr>
+        <w:t xml:space="preserve">继承。这导致该类的所有</w:t>
+      </w:r>
+      <w:r>
+        <w:t xml:space="preserve"> </w:t>
+      </w:r>
+      <w:r>
+        <w:rPr>
+          <w:rStyle w:val="VerbatimChar"/>
+        </w:rPr>
+        <w:t xml:space="preserve">nn.Parameter</w:t>
+      </w:r>
+      <w:r>
+        <w:t xml:space="preserve"> </w:t>
+      </w:r>
+      <w:r>
+        <w:rPr>
+          <w:rFonts w:hint="eastAsia"/>
+        </w:rPr>
+        <w:t xml:space="preserve">和子模块（RMSNorm、MultiHeadAttention、SwiGLU）无法被</w:t>
+      </w:r>
+      <w:r>
+        <w:t xml:space="preserve"> PyTorch </w:t>
+      </w:r>
+      <w:r>
+        <w:rPr>
+          <w:rFonts w:hint="eastAsia"/>
+        </w:rPr>
+        <w:t xml:space="preserve">的</w:t>
+      </w:r>
+      <w:r>
+        <w:t xml:space="preserve"> </w:t>
+      </w:r>
+      <w:r>
+        <w:rPr>
+          <w:rStyle w:val="VerbatimChar"/>
+        </w:rPr>
+        <w:t xml:space="preserve">model.parameters()</w:t>
+      </w:r>
+      <w:r>
+        <w:t xml:space="preserve"> </w:t>
+      </w:r>
+      <w:r>
+        <w:rPr>
+          <w:rFonts w:hint="eastAsia"/>
+        </w:rPr>
+        <w:t xml:space="preserve">自动发现——这些参数在优化器中”不存在”，</w:t>
+      </w:r>
+      <w:r>
+        <w:rPr>
+          <w:rFonts w:hint="eastAsia"/>
+          <w:b/>
+          <w:bCs/>
+        </w:rPr>
+        <w:t xml:space="preserve">完全不参与训练</w:t>
+      </w:r>
+      <w:r>
+        <w:rPr>
+          <w:rFonts w:hint="eastAsia"/>
+        </w:rPr>
+        <w:t xml:space="preserve">。损失只能降到</w:t>
+      </w:r>
+      <w:r>
+        <w:t xml:space="preserve"> 5 </w:t>
+      </w:r>
+      <w:r>
+        <w:rPr>
+          <w:rFonts w:hint="eastAsia"/>
+        </w:rPr>
+        <w:t xml:space="preserve">左右就再也下不去了（正常的训练损失应当降到</w:t>
+      </w:r>
+      <w:r>
+        <w:t xml:space="preserve"> 3.5 </w:t>
+      </w:r>
+      <w:r>
+        <w:rPr>
+          <w:rFonts w:hint="eastAsia"/>
+        </w:rPr>
+        <w:t xml:space="preserve">左右），我们排查了很久才发现是继承缺失的问题。加上</w:t>
+      </w:r>
+      <w:r>
+        <w:t xml:space="preserve"> </w:t>
+      </w:r>
+      <w:r>
+        <w:rPr>
+          <w:rStyle w:val="VerbatimChar"/>
+        </w:rPr>
+        <w:t xml:space="preserve">nn.Module</w:t>
+      </w:r>
+      <w:r>
+        <w:t xml:space="preserve"> </w:t>
+      </w:r>
+      <w:r>
+        <w:rPr>
+          <w:rFonts w:hint="eastAsia"/>
+        </w:rPr>
+        <w:t xml:space="preserve">继承后，损失立刻正常下降。</w:t>
+      </w:r>
+    </w:p>
+    <w:p>
+      <w:pPr>
+        <w:pStyle w:val="BodyText"/>
+      </w:pPr>
+      <w:r>
+        <w:rPr>
+          <w:b/>
+          <w:bCs/>
+        </w:rPr>
+        <w:t xml:space="preserve">Bug </w:t>
+      </w:r>
+      <w:r>
+        <w:rPr>
+          <w:rFonts w:hint="eastAsia"/>
+          <w:b/>
+          <w:bCs/>
+        </w:rPr>
+        <w:t xml:space="preserve">2：Tokenizer</w:t>
+      </w:r>
+      <w:r>
+        <w:rPr>
+          <w:b/>
+          <w:bCs/>
+        </w:rPr>
+        <w:t xml:space="preserve"> </w:t>
+      </w:r>
+      <w:r>
+        <w:rPr>
+          <w:rFonts w:hint="eastAsia"/>
+          <w:b/>
+          <w:bCs/>
+        </w:rPr>
+        <w:t xml:space="preserve">忘记加入特殊符号。</w:t>
+      </w:r>
+      <w:r>
+        <w:t xml:space="preserve"> </w:t>
+      </w:r>
+      <w:r>
+        <w:rPr>
+          <w:rFonts w:hint="eastAsia"/>
+        </w:rPr>
+        <w:t xml:space="preserve">在</w:t>
+      </w:r>
+      <w:r>
+        <w:t xml:space="preserve"> BPE </w:t>
+      </w:r>
+      <w:r>
+        <w:rPr>
+          <w:rFonts w:hint="eastAsia"/>
+        </w:rPr>
+        <w:t xml:space="preserve">训练和编码阶段，我们忘记将</w:t>
+      </w:r>
+      <w:r>
+        <w:t xml:space="preserve"> </w:t>
+      </w:r>
+      <w:r>
+        <w:rPr>
+          <w:rStyle w:val="VerbatimChar"/>
+        </w:rPr>
+        <w:t xml:space="preserve">&gt;</w:t>
+      </w:r>
+      <w:r>
+        <w:t xml:space="preserve"> </w:t>
+      </w:r>
+      <w:r>
+        <w:rPr>
+          <w:rFonts w:hint="eastAsia"/>
+        </w:rPr>
+        <w:t xml:space="preserve">等特殊符号加入数据预处理流程。结果是——模型训练完成后虽然能生成通顺的文本，但</w:t>
+      </w:r>
+      <w:r>
+        <w:rPr>
+          <w:rFonts w:hint="eastAsia"/>
+          <w:b/>
+          <w:bCs/>
+        </w:rPr>
+        <w:t xml:space="preserve">无法输出终止符号</w:t>
+      </w:r>
+      <w:r>
+        <w:rPr>
+          <w:rFonts w:hint="eastAsia"/>
+        </w:rPr>
+        <w:t xml:space="preserve">，只能靠我们手动设置的最大长度来截断生成。生成内容往往会一直絮叨下去，直到达到</w:t>
+      </w:r>
+      <w:r>
+        <w:t xml:space="preserve"> </w:t>
+      </w:r>
+      <w:r>
+        <w:rPr>
+          <w:rStyle w:val="VerbatimChar"/>
+        </w:rPr>
+        <w:t xml:space="preserve">max_tokens</w:t>
+      </w:r>
+      <w:r>
+        <w:t xml:space="preserve"> </w:t>
+      </w:r>
+      <w:r>
+        <w:rPr>
+          <w:rFonts w:hint="eastAsia"/>
+        </w:rPr>
+        <w:t xml:space="preserve">上限。这个</w:t>
+      </w:r>
+      <w:r>
+        <w:t xml:space="preserve"> bug </w:t>
+      </w:r>
+      <w:r>
+        <w:rPr>
+          <w:rFonts w:hint="eastAsia"/>
+        </w:rPr>
+        <w:t xml:space="preserve">的修复只需要在编码数据时确保特殊</w:t>
+      </w:r>
+      <w:r>
+        <w:t xml:space="preserve"> token </w:t>
+      </w:r>
+      <w:r>
+        <w:rPr>
+          <w:rFonts w:hint="eastAsia"/>
+        </w:rPr>
+        <w:t xml:space="preserve">被正确加入词表和训练数据中，但因为没有在</w:t>
+      </w:r>
+      <w:r>
+        <w:t xml:space="preserve"> tokenizer </w:t>
+      </w:r>
+      <w:r>
+        <w:rPr>
+          <w:rFonts w:hint="eastAsia"/>
+        </w:rPr>
+        <w:t xml:space="preserve">层面写测试，直到推理阶段才发现问题.</w:t>
+      </w:r>
+    </w:p>
+    <w:p>
+      <w:pPr>
+        <w:pStyle w:val="BodyText"/>
+      </w:pPr>
+      <w:r>
+        <w:rPr>
+          <w:rFonts w:hint="eastAsia"/>
+        </w:rPr>
+        <w:t xml:space="preserve">这两个</w:t>
+      </w:r>
+      <w:r>
+        <w:t xml:space="preserve"> bug </w:t>
+      </w:r>
+      <w:r>
+        <w:rPr>
+          <w:rFonts w:hint="eastAsia"/>
+        </w:rPr>
+        <w:t xml:space="preserve">的教训是：</w:t>
+      </w:r>
+      <w:r>
+        <w:rPr>
+          <w:rFonts w:hint="eastAsia"/>
+          <w:b/>
+          <w:bCs/>
+        </w:rPr>
+        <w:t xml:space="preserve">每个模块写完之后一定要写测试</w:t>
+      </w:r>
+      <w:r>
+        <w:t xml:space="preserve">。Tokenizer </w:t>
+      </w:r>
+      <w:r>
+        <w:rPr>
+          <w:rFonts w:hint="eastAsia"/>
+        </w:rPr>
+        <w:t xml:space="preserve">的测试（编码-解码一致性、特殊</w:t>
+      </w:r>
+      <w:r>
+        <w:t xml:space="preserve"> token </w:t>
+      </w:r>
+      <w:r>
+        <w:rPr>
+          <w:rFonts w:hint="eastAsia"/>
+        </w:rPr>
+        <w:t xml:space="preserve">处理）、模型的测试（参数可训练性验证、前向-反向完整性检查、梯度流动检查）都应该在开始正式训练之前完成。花</w:t>
+      </w:r>
+      <w:r>
+        <w:t xml:space="preserve"> 30 </w:t>
+      </w:r>
+      <w:r>
+        <w:rPr>
+          <w:rFonts w:hint="eastAsia"/>
+        </w:rPr>
+        <w:t xml:space="preserve">分钟写测试，可能省下</w:t>
+      </w:r>
+      <w:r>
+        <w:t xml:space="preserve"> 6 </w:t>
+      </w:r>
+      <w:r>
+        <w:rPr>
+          <w:rFonts w:hint="eastAsia"/>
+        </w:rPr>
+        <w:t xml:space="preserve">小时的无效训练。</w:t>
+      </w:r>
+    </w:p>
+    <w:bookmarkEnd w:id="125"/>
+    <w:bookmarkEnd w:id="126"/>
+    <w:bookmarkStart w:id="127" w:name="一定要看数据集内容"/>
+    <w:p>
+      <w:pPr>
+        <w:pStyle w:val="Heading3"/>
+      </w:pPr>
+      <w:r>
+        <w:t xml:space="preserve">10.3 </w:t>
+      </w:r>
+      <w:r>
+        <w:rPr>
+          <w:rFonts w:hint="eastAsia"/>
+        </w:rPr>
+        <w:t xml:space="preserve">一定要看数据集内容！！！</w:t>
+      </w:r>
+    </w:p>
+    <w:bookmarkEnd w:id="127"/>
+    <w:bookmarkStart w:id="128" w:name="参数初始化对本实验影响不大"/>
+    <w:p>
+      <w:pPr>
+        <w:pStyle w:val="Heading3"/>
+      </w:pPr>
+      <w:r>
+        <w:t xml:space="preserve">10.4 </w:t>
+      </w:r>
+      <w:r>
+        <w:rPr>
+          <w:rFonts w:hint="eastAsia"/>
+        </w:rPr>
+        <w:t xml:space="preserve">参数初始化对本实验影响不大</w:t>
+      </w:r>
+    </w:p>
+    <w:p>
+      <w:pPr>
+        <w:pStyle w:val="FirstParagraph"/>
+      </w:pPr>
+      <w:r>
+        <w:rPr>
+          <w:rFonts w:hint="eastAsia"/>
+        </w:rPr>
+        <w:t xml:space="preserve">我们在这个项目中对参数初始化做了详细的调研和自定义实现（见</w:t>
+      </w:r>
+      <w:r>
+        <w:t xml:space="preserve"> </w:t>
+      </w:r>
+      <w:hyperlink w:anchor="sec-param-init">
+        <w:r>
+          <w:rPr>
+            <w:rStyle w:val="Hyperlink"/>
+          </w:rPr>
+          <w:t xml:space="preserve">5.1 </w:t>
+        </w:r>
+        <w:r>
+          <w:rPr>
+            <w:rStyle w:val="Hyperlink"/>
+            <w:rFonts w:hint="eastAsia"/>
+          </w:rPr>
+          <w:t xml:space="preserve">节</w:t>
+        </w:r>
+      </w:hyperlink>
+      <w:r>
+        <w:rPr>
+          <w:rFonts w:hint="eastAsia"/>
+        </w:rPr>
+        <w:t xml:space="preserve">），使用了截断正态分布、精心选择了</w:t>
+      </w:r>
+      <w:r>
+        <w:t xml:space="preserve"> </w:t>
+      </w:r>
+      <m:oMath>
+        <m:r>
+          <m:t>σ</m:t>
+        </m:r>
+        <m:r>
+          <m:rPr>
+            <m:sty m:val="p"/>
+          </m:rPr>
+          <m:t>=</m:t>
+        </m:r>
+        <m:r>
+          <m:t>0.02</m:t>
+        </m:r>
+      </m:oMath>
+      <w:r>
+        <w:t xml:space="preserve"> </w:t>
+      </w:r>
+      <w:r>
+        <w:rPr>
+          <w:rFonts w:hint="eastAsia"/>
+        </w:rPr>
+        <w:t xml:space="preserve">等参数。但实验结果表明：在本项目的规模（80M</w:t>
+      </w:r>
+      <w:r>
+        <w:t xml:space="preserve"> </w:t>
+      </w:r>
+      <w:r>
+        <w:rPr>
+          <w:rFonts w:hint="eastAsia"/>
+        </w:rPr>
+        <w:t xml:space="preserve">参数、1</w:t>
+      </w:r>
+      <w:r>
+        <w:t xml:space="preserve"> </w:t>
+      </w:r>
+      <w:r>
+        <w:rPr>
+          <w:rFonts w:hint="eastAsia"/>
+        </w:rPr>
+        <w:t xml:space="preserve">个</w:t>
+      </w:r>
+      <w:r>
+        <w:t xml:space="preserve"> epoch、14.58 </w:t>
+      </w:r>
+      <w:r>
+        <w:rPr>
+          <w:rFonts w:hint="eastAsia"/>
+        </w:rPr>
+        <w:t xml:space="preserve">亿</w:t>
+      </w:r>
+      <w:r>
+        <w:t xml:space="preserve"> </w:t>
+      </w:r>
+      <w:r>
+        <w:rPr>
+          <w:rFonts w:hint="eastAsia"/>
+        </w:rPr>
+        <w:t xml:space="preserve">token）下，</w:t>
+      </w:r>
+      <w:r>
+        <w:rPr>
+          <w:rFonts w:hint="eastAsia"/>
+          <w:b/>
+          <w:bCs/>
+        </w:rPr>
+        <w:t xml:space="preserve">参数初始化对最终训练结果几乎没有影响</w:t>
+      </w:r>
+      <w:r>
+        <w:t xml:space="preserve">。</w:t>
+      </w:r>
+    </w:p>
+    <w:p>
+      <w:pPr>
+        <w:pStyle w:val="BodyText"/>
+      </w:pPr>
+      <w:r>
+        <w:rPr>
+          <w:rFonts w:hint="eastAsia"/>
+        </w:rPr>
+        <w:t xml:space="preserve">无论是</w:t>
+      </w:r>
+      <w:r>
+        <w:t xml:space="preserve"> Xavier </w:t>
+      </w:r>
+      <w:r>
+        <w:rPr>
+          <w:rFonts w:hint="eastAsia"/>
+        </w:rPr>
+        <w:t xml:space="preserve">初始化、He</w:t>
+      </w:r>
+      <w:r>
+        <w:t xml:space="preserve"> </w:t>
+      </w:r>
+      <w:r>
+        <w:rPr>
+          <w:rFonts w:hint="eastAsia"/>
+        </w:rPr>
+        <w:t xml:space="preserve">初始化、还是我们的截断正态分布，只要初始化的方差不过大（不导致梯度爆炸）或过小（不导致梯度消失），模型都能在几百步内迅速调整到相近的损失水平。这是因为：</w:t>
+      </w:r>
+    </w:p>
+    <w:p>
+      <w:pPr>
+        <w:pStyle w:val="Compact"/>
+        <w:numPr>
+          <w:ilvl w:val="0"/>
+          <w:numId w:val="1041"/>
+        </w:numPr>
+      </w:pPr>
+      <w:r>
+        <w:t xml:space="preserve">80M </w:t>
+      </w:r>
+      <w:r>
+        <w:rPr>
+          <w:rFonts w:hint="eastAsia"/>
+        </w:rPr>
+        <w:t xml:space="preserve">参数模型的优化空间相对简单，优化器（AdamW）能够在足够多的训练步数内补偿初始化的差异</w:t>
+      </w:r>
+    </w:p>
+    <w:p>
+      <w:pPr>
+        <w:pStyle w:val="Compact"/>
+        <w:numPr>
+          <w:ilvl w:val="0"/>
+          <w:numId w:val="1041"/>
+        </w:numPr>
+      </w:pPr>
+      <w:r>
+        <w:t xml:space="preserve">14.58 </w:t>
+      </w:r>
+      <w:r>
+        <w:rPr>
+          <w:rFonts w:hint="eastAsia"/>
+        </w:rPr>
+        <w:t xml:space="preserve">亿</w:t>
+      </w:r>
+      <w:r>
+        <w:t xml:space="preserve"> token </w:t>
+      </w:r>
+      <w:r>
+        <w:rPr>
+          <w:rFonts w:hint="eastAsia"/>
+        </w:rPr>
+        <w:t xml:space="preserve">的训练量足以让模型”忘记”初始化的影响</w:t>
+      </w:r>
+    </w:p>
+    <w:p>
+      <w:pPr>
+        <w:pStyle w:val="Compact"/>
+        <w:numPr>
+          <w:ilvl w:val="0"/>
+          <w:numId w:val="1041"/>
+        </w:numPr>
+      </w:pPr>
+      <w:r>
+        <w:t xml:space="preserve">Pre-Norm </w:t>
+      </w:r>
+      <w:r>
+        <w:rPr>
+          <w:rFonts w:hint="eastAsia"/>
+        </w:rPr>
+        <w:t xml:space="preserve">架构本身就降低了对初始化的敏感度</w:t>
+      </w:r>
+    </w:p>
+    <w:p>
+      <w:pPr>
+        <w:pStyle w:val="FirstParagraph"/>
+      </w:pPr>
+      <w:r>
+        <w:rPr>
+          <w:rFonts w:hint="eastAsia"/>
+        </w:rPr>
+        <w:t xml:space="preserve">参数初始化真正变得关键是在</w:t>
+      </w:r>
+      <w:r>
+        <w:rPr>
+          <w:rFonts w:hint="eastAsia"/>
+          <w:b/>
+          <w:bCs/>
+        </w:rPr>
+        <w:t xml:space="preserve">更大规模模型</w:t>
+      </w:r>
+      <w:r>
+        <w:rPr>
+          <w:rFonts w:hint="eastAsia"/>
+        </w:rPr>
+        <w:t xml:space="preserve">（1B+</w:t>
+      </w:r>
+      <w:r>
+        <w:t xml:space="preserve"> </w:t>
+      </w:r>
+      <w:r>
+        <w:rPr>
+          <w:rFonts w:hint="eastAsia"/>
+        </w:rPr>
+        <w:t xml:space="preserve">参数）和</w:t>
+      </w:r>
+      <w:r>
+        <w:rPr>
+          <w:rFonts w:hint="eastAsia"/>
+          <w:b/>
+          <w:bCs/>
+        </w:rPr>
+        <w:t xml:space="preserve">更深网络</w:t>
+      </w:r>
+      <w:r>
+        <w:rPr>
+          <w:rFonts w:hint="eastAsia"/>
+        </w:rPr>
+        <w:t xml:space="preserve">（48+</w:t>
+      </w:r>
+      <w:r>
+        <w:t xml:space="preserve"> </w:t>
+      </w:r>
+      <w:r>
+        <w:rPr>
+          <w:rFonts w:hint="eastAsia"/>
+        </w:rPr>
+        <w:t xml:space="preserve">层）上，那时不当的初始化会导致训练前期梯度爆炸或梯度消失，直接导致训练失败。但对于本项目这种小规模实验，初始化的重要性被高估了——</w:t>
+      </w:r>
+      <w:r>
+        <w:rPr>
+          <w:rFonts w:hint="eastAsia"/>
+          <w:b/>
+          <w:bCs/>
+        </w:rPr>
+        <w:t xml:space="preserve">把时间花在检查数据和写测试上，性价比远高于调初始化参数</w:t>
+      </w:r>
+      <w:r>
+        <w:t xml:space="preserve">.</w:t>
+      </w:r>
+    </w:p>
+    <w:p>
+      <w:pPr>
+        <w:pStyle w:val="BodyText"/>
+      </w:pPr>
+      <w:r>
+        <w:rPr>
+          <w:rFonts w:hint="eastAsia"/>
+        </w:rPr>
+        <w:t xml:space="preserve">数据集</w:t>
+      </w:r>
+      <w:r>
+        <w:t xml:space="preserve"> </w:t>
+      </w:r>
+      <w:r>
+        <w:rPr>
+          <w:rFonts w:hint="eastAsia"/>
+        </w:rPr>
+        <w:t xml:space="preserve">数据量多少？</w:t>
+      </w:r>
+      <w:r>
+        <w:t xml:space="preserve"> </w:t>
+      </w:r>
+      <w:r>
+        <w:rPr>
+          <w:rFonts w:hint="eastAsia"/>
+        </w:rPr>
+        <w:t xml:space="preserve">pertaring效果</w:t>
+      </w:r>
+      <w:r>
+        <w:t xml:space="preserve"> </w:t>
+      </w:r>
+      <w:r>
+        <w:rPr>
+          <w:rFonts w:hint="eastAsia"/>
+        </w:rPr>
+        <w:t xml:space="preserve">知识储备</w:t>
+      </w:r>
+      <w:r>
+        <w:t xml:space="preserve"> </w:t>
+      </w:r>
+      <w:r>
+        <w:rPr>
+          <w:rFonts w:hint="eastAsia"/>
+        </w:rPr>
+        <w:t xml:space="preserve">续写能力</w:t>
+      </w:r>
+      <w:r>
+        <w:t xml:space="preserve"> </w:t>
+      </w:r>
+      <w:r>
+        <w:rPr>
+          <w:rFonts w:hint="eastAsia"/>
+        </w:rPr>
+        <w:t xml:space="preserve">损失函数</w:t>
+      </w:r>
+      <w:r>
+        <w:t xml:space="preserve"> </w:t>
+      </w:r>
+      <w:r>
+        <w:rPr>
+          <w:rFonts w:hint="eastAsia"/>
+        </w:rPr>
+        <w:t xml:space="preserve">2以下</w:t>
+      </w:r>
+    </w:p>
+    <w:bookmarkEnd w:id="128"/>
+    <w:bookmarkEnd w:id="129"/>
     <w:sectPr>
       <w:footnotePr>
         <w:numRestart w:val="eachSect"/>
@@ -49878,6 +50771,9 @@
     <w:lvlOverride w:ilvl="8">
       <w:startOverride w:val="1"/>
     </w:lvlOverride>
+  </w:num>
+  <w:num w:numId="1041">
+    <w:abstractNumId w:val="991"/>
   </w:num>
 </w:numbering>
 </file>

</xml_diff>

<commit_message>
Fix LLM Pre-Training page visualization: images now render as block-level figures
- Added blank lines around Chinchilla.png, 2D_Rotation_Demo.png, loss.png, val_loss.png, lr.png
- Added {#sec-param-init} label to section 5.1 to fix typst cross-reference error
- Re-rendered full site to update docs/

Co-Authored-By: Claude Opus 4.8 <noreply@anthropic.com>
</commit_message>
<xml_diff>
--- a/docs/posts/Projects/LLM_Pre-Training/报告.docx
+++ b/docs/posts/Projects/LLM_Pre-Training/报告.docx
@@ -5446,7 +5446,7 @@
         <w:t xml:space="preserve">头组成。以下逐一介绍各组件。</w:t>
       </w:r>
     </w:p>
-    <w:bookmarkStart w:id="31" w:name="参数初始化"/>
+    <w:bookmarkStart w:id="31" w:name="sec-param-init"/>
     <w:p>
       <w:pPr>
         <w:pStyle w:val="Heading3"/>
@@ -13337,7 +13337,7 @@
     </w:p>
     <w:p>
       <w:pPr>
-        <w:pStyle w:val="FirstParagraph"/>
+        <w:pStyle w:val="CaptionedFigure"/>
       </w:pPr>
       <w:r>
         <w:drawing>
@@ -13380,6 +13380,14 @@
             </a:graphic>
           </wp:inline>
         </w:drawing>
+      </w:r>
+    </w:p>
+    <w:p>
+      <w:pPr>
+        <w:pStyle w:val="ImageCaption"/>
+      </w:pPr>
+      <w:r>
+        <w:t xml:space="preserve">2D Rotation Demo</w:t>
       </w:r>
     </w:p>
     <w:p>
@@ -35845,9 +35853,11 @@
         </w:rPr>
         <w:t xml:space="preserve">，即初始均匀分布对应的交叉熵）逐步下降，训练初期下降最快，随后进入平稳下降阶段，最终在3.45附近，未观察到明显的过拟合或发散迹象。</w:t>
       </w:r>
-      <w:r>
-        <w:t xml:space="preserve"> </w:t>
-      </w:r>
+    </w:p>
+    <w:p>
+      <w:pPr>
+        <w:pStyle w:val="CaptionedFigure"/>
+      </w:pPr>
       <w:r>
         <w:drawing>
           <wp:inline>
@@ -35893,10 +35903,21 @@
     </w:p>
     <w:p>
       <w:pPr>
+        <w:pStyle w:val="ImageCaption"/>
+      </w:pPr>
+      <w:r>
+        <w:rPr>
+          <w:rFonts w:hint="eastAsia"/>
+        </w:rPr>
+        <w:t xml:space="preserve">损失曲线</w:t>
+      </w:r>
+    </w:p>
+    <w:p>
+      <w:pPr>
         <w:pStyle w:val="Compact"/>
         <w:numPr>
           <w:ilvl w:val="0"/>
-          <w:numId w:val="1033"/>
+          <w:numId w:val="1034"/>
         </w:numPr>
       </w:pPr>
       <w:r>
@@ -35931,9 +35952,11 @@
         </w:rPr>
         <w:t xml:space="preserve">gap，说明模型泛化良好。</w:t>
       </w:r>
-      <w:r>
-        <w:t xml:space="preserve"> </w:t>
-      </w:r>
+    </w:p>
+    <w:p>
+      <w:pPr>
+        <w:pStyle w:val="CaptionedFigure"/>
+      </w:pPr>
       <w:r>
         <w:drawing>
           <wp:inline>
@@ -35979,10 +36002,21 @@
     </w:p>
     <w:p>
       <w:pPr>
+        <w:pStyle w:val="ImageCaption"/>
+      </w:pPr>
+      <w:r>
+        <w:rPr>
+          <w:rFonts w:hint="eastAsia"/>
+        </w:rPr>
+        <w:t xml:space="preserve">验证损失曲线</w:t>
+      </w:r>
+    </w:p>
+    <w:p>
+      <w:pPr>
         <w:pStyle w:val="Compact"/>
         <w:numPr>
           <w:ilvl w:val="0"/>
-          <w:numId w:val="1033"/>
+          <w:numId w:val="1035"/>
         </w:numPr>
       </w:pPr>
       <w:r>
@@ -36038,9 +36072,11 @@
       <w:r>
         <w:t xml:space="preserve"> 4e-5。</w:t>
       </w:r>
-      <w:r>
-        <w:t xml:space="preserve"> </w:t>
-      </w:r>
+    </w:p>
+    <w:p>
+      <w:pPr>
+        <w:pStyle w:val="CaptionedFigure"/>
+      </w:pPr>
       <w:r>
         <w:drawing>
           <wp:inline>
@@ -36084,6 +36120,17 @@
         </w:drawing>
       </w:r>
     </w:p>
+    <w:p>
+      <w:pPr>
+        <w:pStyle w:val="ImageCaption"/>
+      </w:pPr>
+      <w:r>
+        <w:rPr>
+          <w:rFonts w:hint="eastAsia"/>
+        </w:rPr>
+        <w:t xml:space="preserve">学习率曲线</w:t>
+      </w:r>
+    </w:p>
     <w:bookmarkEnd w:id="107"/>
     <w:bookmarkStart w:id="108" w:name="结果"/>
     <w:p>
@@ -36503,55 +36550,7 @@
         <w:pStyle w:val="Compact"/>
         <w:numPr>
           <w:ilvl w:val="0"/>
-          <w:numId w:val="1034"/>
-        </w:numPr>
-      </w:pPr>
-    </w:p>
-    <w:p>
-      <w:pPr>
-        <w:pStyle w:val="Compact"/>
-        <w:numPr>
-          <w:ilvl w:val="1"/>
-          <w:numId w:val="1035"/>
-        </w:numPr>
-      </w:pPr>
-      <w:r>
-        <w:rPr>
-          <w:rFonts w:hint="eastAsia"/>
-        </w:rPr>
-        <w:t xml:space="preserve">事实性错误较多，如编造人名、地名、事件；</w:t>
-      </w:r>
-    </w:p>
-    <w:p>
-      <w:pPr>
-        <w:pStyle w:val="Compact"/>
-        <w:numPr>
-          <w:ilvl w:val="0"/>
-          <w:numId w:val="1034"/>
-        </w:numPr>
-      </w:pPr>
-    </w:p>
-    <w:p>
-      <w:pPr>
-        <w:pStyle w:val="Compact"/>
-        <w:numPr>
-          <w:ilvl w:val="1"/>
           <w:numId w:val="1036"/>
-        </w:numPr>
-      </w:pPr>
-      <w:r>
-        <w:rPr>
-          <w:rFonts w:hint="eastAsia"/>
-        </w:rPr>
-        <w:t xml:space="preserve">长距离逻辑一致性较弱，主题漂移明显；</w:t>
-      </w:r>
-    </w:p>
-    <w:p>
-      <w:pPr>
-        <w:pStyle w:val="Compact"/>
-        <w:numPr>
-          <w:ilvl w:val="0"/>
-          <w:numId w:val="1034"/>
         </w:numPr>
       </w:pPr>
     </w:p>
@@ -36561,6 +36560,54 @@
         <w:numPr>
           <w:ilvl w:val="1"/>
           <w:numId w:val="1037"/>
+        </w:numPr>
+      </w:pPr>
+      <w:r>
+        <w:rPr>
+          <w:rFonts w:hint="eastAsia"/>
+        </w:rPr>
+        <w:t xml:space="preserve">事实性错误较多，如编造人名、地名、事件；</w:t>
+      </w:r>
+    </w:p>
+    <w:p>
+      <w:pPr>
+        <w:pStyle w:val="Compact"/>
+        <w:numPr>
+          <w:ilvl w:val="0"/>
+          <w:numId w:val="1036"/>
+        </w:numPr>
+      </w:pPr>
+    </w:p>
+    <w:p>
+      <w:pPr>
+        <w:pStyle w:val="Compact"/>
+        <w:numPr>
+          <w:ilvl w:val="1"/>
+          <w:numId w:val="1038"/>
+        </w:numPr>
+      </w:pPr>
+      <w:r>
+        <w:rPr>
+          <w:rFonts w:hint="eastAsia"/>
+        </w:rPr>
+        <w:t xml:space="preserve">长距离逻辑一致性较弱，主题漂移明显；</w:t>
+      </w:r>
+    </w:p>
+    <w:p>
+      <w:pPr>
+        <w:pStyle w:val="Compact"/>
+        <w:numPr>
+          <w:ilvl w:val="0"/>
+          <w:numId w:val="1036"/>
+        </w:numPr>
+      </w:pPr>
+    </w:p>
+    <w:p>
+      <w:pPr>
+        <w:pStyle w:val="Compact"/>
+        <w:numPr>
+          <w:ilvl w:val="1"/>
+          <w:numId w:val="1039"/>
         </w:numPr>
       </w:pPr>
       <w:r>
@@ -36948,7 +36995,7 @@
         <w:pStyle w:val="Compact"/>
         <w:numPr>
           <w:ilvl w:val="0"/>
-          <w:numId w:val="1038"/>
+          <w:numId w:val="1040"/>
         </w:numPr>
       </w:pPr>
       <w:r>
@@ -37041,7 +37088,7 @@
         <w:pStyle w:val="Compact"/>
         <w:numPr>
           <w:ilvl w:val="0"/>
-          <w:numId w:val="1038"/>
+          <w:numId w:val="1040"/>
         </w:numPr>
       </w:pPr>
       <w:r>
@@ -37189,7 +37236,7 @@
         <w:pStyle w:val="Compact"/>
         <w:numPr>
           <w:ilvl w:val="0"/>
-          <w:numId w:val="1038"/>
+          <w:numId w:val="1040"/>
         </w:numPr>
       </w:pPr>
       <w:r>
@@ -39193,9 +39240,11 @@
         </w:rPr>
         <w:t xml:space="preserve">的结论完全吻合。</w:t>
       </w:r>
-      <w:r>
-        <w:t xml:space="preserve"> </w:t>
-      </w:r>
+    </w:p>
+    <w:p>
+      <w:pPr>
+        <w:pStyle w:val="CaptionedFigure"/>
+      </w:pPr>
       <w:r>
         <w:drawing>
           <wp:inline>
@@ -39238,9 +39287,25 @@
           </wp:inline>
         </w:drawing>
       </w:r>
-      <w:r>
-        <w:t xml:space="preserve"> </w:t>
-      </w:r>
+    </w:p>
+    <w:p>
+      <w:pPr>
+        <w:pStyle w:val="ImageCaption"/>
+      </w:pPr>
+      <w:r>
+        <w:t xml:space="preserve">Chinchilla IsoFLOP </w:t>
+      </w:r>
+      <w:r>
+        <w:rPr>
+          <w:rFonts w:hint="eastAsia"/>
+        </w:rPr>
+        <w:t xml:space="preserve">曲线</w:t>
+      </w:r>
+    </w:p>
+    <w:p>
+      <w:pPr>
+        <w:pStyle w:val="BodyText"/>
+      </w:pPr>
       <w:r>
         <w:rPr>
           <w:rFonts w:hint="eastAsia"/>
@@ -42232,7 +42297,7 @@
         <w:pStyle w:val="Compact"/>
         <w:numPr>
           <w:ilvl w:val="0"/>
-          <w:numId w:val="1039"/>
+          <w:numId w:val="1041"/>
         </w:numPr>
       </w:pPr>
       <w:r>
@@ -42277,7 +42342,7 @@
         <w:pStyle w:val="Compact"/>
         <w:numPr>
           <w:ilvl w:val="0"/>
-          <w:numId w:val="1039"/>
+          <w:numId w:val="1041"/>
         </w:numPr>
       </w:pPr>
       <w:r>
@@ -46502,7 +46567,7 @@
         <w:pStyle w:val="Compact"/>
         <w:numPr>
           <w:ilvl w:val="0"/>
-          <w:numId w:val="1040"/>
+          <w:numId w:val="1042"/>
         </w:numPr>
       </w:pPr>
       <w:r>
@@ -46561,7 +46626,7 @@
         <w:pStyle w:val="Compact"/>
         <w:numPr>
           <w:ilvl w:val="0"/>
-          <w:numId w:val="1040"/>
+          <w:numId w:val="1042"/>
         </w:numPr>
       </w:pPr>
       <w:r>
@@ -46772,7 +46837,7 @@
         <w:pStyle w:val="Compact"/>
         <w:numPr>
           <w:ilvl w:val="0"/>
-          <w:numId w:val="1040"/>
+          <w:numId w:val="1042"/>
         </w:numPr>
       </w:pPr>
       <w:r>
@@ -49467,7 +49532,7 @@
         <w:pStyle w:val="Compact"/>
         <w:numPr>
           <w:ilvl w:val="0"/>
-          <w:numId w:val="1041"/>
+          <w:numId w:val="1043"/>
         </w:numPr>
       </w:pPr>
       <w:r>
@@ -49485,7 +49550,7 @@
         <w:pStyle w:val="Compact"/>
         <w:numPr>
           <w:ilvl w:val="0"/>
-          <w:numId w:val="1041"/>
+          <w:numId w:val="1043"/>
         </w:numPr>
       </w:pPr>
       <w:r>
@@ -49512,7 +49577,7 @@
         <w:pStyle w:val="Compact"/>
         <w:numPr>
           <w:ilvl w:val="0"/>
-          <w:numId w:val="1041"/>
+          <w:numId w:val="1043"/>
         </w:numPr>
       </w:pPr>
       <w:r>
@@ -50620,6 +50685,12 @@
     <w:abstractNumId w:val="991"/>
   </w:num>
   <w:num w:numId="1035">
+    <w:abstractNumId w:val="991"/>
+  </w:num>
+  <w:num w:numId="1036">
+    <w:abstractNumId w:val="991"/>
+  </w:num>
+  <w:num w:numId="1037">
     <w:abstractNumId w:val="99431"/>
     <w:lvlOverride w:ilvl="0">
       <w:startOverride w:val="1"/>
@@ -50649,7 +50720,7 @@
       <w:startOverride w:val="1"/>
     </w:lvlOverride>
   </w:num>
-  <w:num w:numId="1036">
+  <w:num w:numId="1038">
     <w:abstractNumId w:val="99432"/>
     <w:lvlOverride w:ilvl="0">
       <w:startOverride w:val="2"/>
@@ -50679,7 +50750,7 @@
       <w:startOverride w:val="2"/>
     </w:lvlOverride>
   </w:num>
-  <w:num w:numId="1037">
+  <w:num w:numId="1039">
     <w:abstractNumId w:val="99433"/>
     <w:lvlOverride w:ilvl="0">
       <w:startOverride w:val="3"/>
@@ -50708,39 +50779,6 @@
     <w:lvlOverride w:ilvl="8">
       <w:startOverride w:val="3"/>
     </w:lvlOverride>
-  </w:num>
-  <w:num w:numId="1038">
-    <w:abstractNumId w:val="99411"/>
-    <w:lvlOverride w:ilvl="0">
-      <w:startOverride w:val="1"/>
-    </w:lvlOverride>
-    <w:lvlOverride w:ilvl="1">
-      <w:startOverride w:val="1"/>
-    </w:lvlOverride>
-    <w:lvlOverride w:ilvl="2">
-      <w:startOverride w:val="1"/>
-    </w:lvlOverride>
-    <w:lvlOverride w:ilvl="3">
-      <w:startOverride w:val="1"/>
-    </w:lvlOverride>
-    <w:lvlOverride w:ilvl="4">
-      <w:startOverride w:val="1"/>
-    </w:lvlOverride>
-    <w:lvlOverride w:ilvl="5">
-      <w:startOverride w:val="1"/>
-    </w:lvlOverride>
-    <w:lvlOverride w:ilvl="6">
-      <w:startOverride w:val="1"/>
-    </w:lvlOverride>
-    <w:lvlOverride w:ilvl="7">
-      <w:startOverride w:val="1"/>
-    </w:lvlOverride>
-    <w:lvlOverride w:ilvl="8">
-      <w:startOverride w:val="1"/>
-    </w:lvlOverride>
-  </w:num>
-  <w:num w:numId="1039">
-    <w:abstractNumId w:val="991"/>
   </w:num>
   <w:num w:numId="1040">
     <w:abstractNumId w:val="99411"/>
@@ -50773,6 +50811,39 @@
     </w:lvlOverride>
   </w:num>
   <w:num w:numId="1041">
+    <w:abstractNumId w:val="991"/>
+  </w:num>
+  <w:num w:numId="1042">
+    <w:abstractNumId w:val="99411"/>
+    <w:lvlOverride w:ilvl="0">
+      <w:startOverride w:val="1"/>
+    </w:lvlOverride>
+    <w:lvlOverride w:ilvl="1">
+      <w:startOverride w:val="1"/>
+    </w:lvlOverride>
+    <w:lvlOverride w:ilvl="2">
+      <w:startOverride w:val="1"/>
+    </w:lvlOverride>
+    <w:lvlOverride w:ilvl="3">
+      <w:startOverride w:val="1"/>
+    </w:lvlOverride>
+    <w:lvlOverride w:ilvl="4">
+      <w:startOverride w:val="1"/>
+    </w:lvlOverride>
+    <w:lvlOverride w:ilvl="5">
+      <w:startOverride w:val="1"/>
+    </w:lvlOverride>
+    <w:lvlOverride w:ilvl="6">
+      <w:startOverride w:val="1"/>
+    </w:lvlOverride>
+    <w:lvlOverride w:ilvl="7">
+      <w:startOverride w:val="1"/>
+    </w:lvlOverride>
+    <w:lvlOverride w:ilvl="8">
+      <w:startOverride w:val="1"/>
+    </w:lvlOverride>
+  </w:num>
+  <w:num w:numId="1043">
     <w:abstractNumId w:val="991"/>
   </w:num>
 </w:numbering>

</xml_diff>

<commit_message>
Add Qwen3-TTS Furina voice cloning project to Projects listing
- Moved project from 添加/ to quarto/posts/Projects/Qwen3_TTS_Furina/
- Added to projects_index.qmd listing
- Removed pdf format and theme override for compatibility
- Re-rendered full site

Co-Authored-By: Claude Opus 4.8 <noreply@anthropic.com>
</commit_message>
<xml_diff>
--- a/docs/posts/Projects/LLM_Pre-Training/报告.docx
+++ b/docs/posts/Projects/LLM_Pre-Training/报告.docx
@@ -48847,11 +48847,14 @@
         <w:t xml:space="preserve">建议</w:t>
       </w:r>
     </w:p>
-    <w:bookmarkStart w:id="126" w:name="优先阅读代码而非训练实操"/>
+    <w:bookmarkStart w:id="125" w:name="优先阅读代码而非训练实操"/>
     <w:p>
       <w:pPr>
         <w:pStyle w:val="Heading3"/>
       </w:pPr>
+      <w:r>
+        <w:t xml:space="preserve">10.1 </w:t>
+      </w:r>
       <w:r>
         <w:rPr>
           <w:rFonts w:hint="eastAsia"/>
@@ -48937,11 +48940,15 @@
         <w:t xml:space="preserve">。</w:t>
       </w:r>
     </w:p>
-    <w:bookmarkStart w:id="125" w:name="代码测试非常重要"/>
+    <w:bookmarkEnd w:id="125"/>
+    <w:bookmarkStart w:id="126" w:name="代码测试非常重要"/>
     <w:p>
       <w:pPr>
-        <w:pStyle w:val="Heading4"/>
+        <w:pStyle w:val="Heading3"/>
       </w:pPr>
+      <w:r>
+        <w:t xml:space="preserve">10.2 </w:t>
+      </w:r>
       <w:r>
         <w:rPr>
           <w:rFonts w:hint="eastAsia"/>
@@ -49357,7 +49364,6 @@
         <w:t xml:space="preserve">小时的无效训练。</w:t>
       </w:r>
     </w:p>
-    <w:bookmarkEnd w:id="125"/>
     <w:bookmarkEnd w:id="126"/>
     <w:bookmarkStart w:id="127" w:name="一定要看数据集内容"/>
     <w:p>

</xml_diff>